<commit_message>
pr tail anchored on QDM(hq); verification 4b: order of the wet days around hq
- pr above the model's last historical quantile hq: QDM(hq) + (x - hq), QDM(hq) = hq times the QDM factor at
  the rank of hq in the same window of the run (xsdba interp_on_quantiles): continuous at hq, strictly increasing
  above it; equals x - hq + ref in the historical run. The previous x - hq + ref could jump at hq in shifted runs
- notebook 4, 4b: per pixel and month, inversions of the wet days (raw order vs adjusted order) below, across and
  above hq, largest drop (validation_utils.pr_order, cached)
- method note updated

Co-Authored-By: Claude Opus 5.5 <noreply@anthropic.com>
</commit_message>
<xml_diff>
--- a/GCM_BA/GCM_BA_F1_method_notes.docx
+++ b/GCM_BA/GCM_BA_F1_method_notes.docx
@@ -1849,7 +1849,7 @@
               <w:rPr>
                 <w:sz w:val="18"/>
               </w:rPr>
-              <w:t>x − hq + ref above the model's last historical quantile hq.</w:t>
+              <w:t>Above the model's last historical quantile hq: QDM(hq) + (x − hq), the value QDM gives to hq in that run plus the excess unchanged (in the historical run QDM(hq) = ERA5's last quantile).</w:t>
             </w:r>
           </w:p>
         </w:tc>
@@ -1863,7 +1863,7 @@
               <w:rPr>
                 <w:sz w:val="18"/>
               </w:rPr>
-              <w:t>Constant correction of Boé et al. (2007), as cited by Cannon et al. (2015).</w:t>
+              <w:t>Constant correction of Boé et al. (2007), as cited by Cannon et al. (2015). Continuous at hq and strictly increasing above it: local test with a wetter future, 65 inversions across hq and none above, against 22 180 across hq with x − hq + ref.</w:t>
             </w:r>
           </w:p>
         </w:tc>
@@ -2037,6 +2037,18 @@
           <w:i w:val="0"/>
         </w:rPr>
         <w:t>Section 4 — pr extremes (largest factors, largest values).</w:t>
+      </w:r>
+    </w:p>
+    <w:p>
+      <w:pPr>
+        <w:pStyle w:val="ListBullet"/>
+        <w:spacing w:after="40"/>
+      </w:pPr>
+      <w:r>
+        <w:rPr>
+          <w:i w:val="0"/>
+        </w:rPr>
+        <w:t>Section 4b — order of the wet days around hq: inversions below hq (QDM itself), across hq (switch to the additive correction) and above hq.</w:t>
       </w:r>
     </w:p>
     <w:p>

</xml_diff>

<commit_message>
Method note: section 5.1 on pr extremes (QDM mechanics, rule above hq, its cost, targeted-cap alternative)
Co-Authored-By: Claude Opus 5.5 <noreply@anthropic.com>
</commit_message>
<xml_diff>
--- a/GCM_BA/GCM_BA_F1_method_notes.docx
+++ b/GCM_BA/GCM_BA_F1_method_notes.docx
@@ -1988,6 +1988,335 @@
         <w:pStyle w:val="Heading2"/>
       </w:pPr>
       <w:r>
+        <w:t>5.1 Precipitation extremes: what the rule above hq does, and what it costs</w:t>
+      </w:r>
+    </w:p>
+    <w:p>
+      <w:r>
+        <w:rPr>
+          <w:b/>
+        </w:rPr>
+        <w:t xml:space="preserve">How QDM treats a future value. </w:t>
+      </w:r>
+      <w:r>
+        <w:rPr>
+          <w:i w:val="0"/>
+        </w:rPr>
+        <w:t>The values of the run being corrected are ranked within that run: a day at the 99th percentile of the future run gets the factor of the 99th percentile, whatever its value. On the rank scale nothing is ever outside the calibration range. Equivalently (Cannon et al. 2015, Eqs. 4–6), the corrected value is ERA5's quantile at rank τ multiplied by the model's relative change at that rank, Δ(τ) = x_future / x_historical(τ).</w:t>
+      </w:r>
+    </w:p>
+    <w:p>
+      <w:r>
+        <w:rPr>
+          <w:b/>
+        </w:rPr>
+        <w:t xml:space="preserve">Why plain QDM gave 800–1300 mm/day. </w:t>
+      </w:r>
+      <w:r>
+        <w:rPr>
+          <w:i w:val="0"/>
+        </w:rPr>
+        <w:t>In dry regions and months the model's historical top quantile is estimated on a handful of wet days that are mostly drizzle. Example (north-west Australia, June): the model's 99.5 % wet-day quantile is 4.2 mm; the same rank in the future run is a real storm of 59.5 mm, so QDM reads a “change” Δ = ×14 and applies it to ERA5's quantile (84 mm): 84 × 14 ≈ 1200 mm/day. The ×14 is not a climate change but the ratio between a rare storm and a drizzle top estimated on very few days.</w:t>
+      </w:r>
+    </w:p>
+    <w:p>
+      <w:r>
+        <w:rPr>
+          <w:b/>
+        </w:rPr>
+        <w:t xml:space="preserve">What the rule does. </w:t>
+      </w:r>
+      <w:r>
+        <w:rPr>
+          <w:i w:val="0"/>
+        </w:rPr>
+        <w:t>For a day above the model's historical top hq, the change is transferred as an amount instead of a ratio: QDM(hq) + (x − hq), where QDM(hq) is the value QDM gives to hq in that run (the factor at the rank of hq). In the example above this gives about 140 mm/day instead of 1200. The rule is continuous at hq and strictly increasing above it.</w:t>
+      </w:r>
+    </w:p>
+    <w:p>
+      <w:r>
+        <w:rPr>
+          <w:b/>
+        </w:rPr>
+        <w:t xml:space="preserve">What it costs. </w:t>
+      </w:r>
+      <w:r>
+        <w:rPr>
+          <w:i w:val="0"/>
+        </w:rPr>
+        <w:t>The rule applies to every day above hq, not only to the pathological cases: in a wetter future, normal extremes are affected too. Example: historical top hq = 10 mm, future 99th percentile = 15 mm, factor ×1.5: plain QDM gives 22.5 mm, the rule about 19 mm. On these days (about 1–2 % of the wet days of the future runs in the local test) the relative change of the extremes is slightly dampened, consistent with the Rx1day slope of 0.82–0.92 over Europe in the first verification.</w:t>
+      </w:r>
+    </w:p>
+    <w:p>
+      <w:r>
+        <w:rPr>
+          <w:b/>
+        </w:rPr>
+        <w:t xml:space="preserve">Alternative closer to the reference implementation. </w:t>
+      </w:r>
+      <w:r>
+        <w:rPr>
+          <w:i w:val="0"/>
+        </w:rPr>
+        <w:t>Cannon's R package MBC (function QDM) caps the relative change Δ (ratio.max, 2 by default) only when the historical quantile is very small (below ratio.max.trace, 10 × the trace), leaving normal extremes to plain QDM (default values to be checked in the package documentation). In our worst cases the historical top was 1–5 mm, above that default threshold, so a targeted cap would need a threshold adapted to our data.</w:t>
+      </w:r>
+    </w:p>
+    <w:tbl>
+      <w:tblPr>
+        <w:tblStyle w:val="TableGrid"/>
+        <w:tblW w:type="auto" w:w="0"/>
+        <w:jc w:val="center"/>
+        <w:tblLayout w:type="fixed"/>
+        <w:tblLook w:firstColumn="1" w:firstRow="1" w:lastColumn="0" w:lastRow="0" w:noHBand="0" w:noVBand="1" w:val="04A0"/>
+      </w:tblPr>
+      <w:tblGrid>
+        <w:gridCol w:w="3137"/>
+        <w:gridCol w:w="3137"/>
+        <w:gridCol w:w="3137"/>
+      </w:tblGrid>
+      <w:tr>
+        <w:trPr>
+          <w:cantSplit/>
+        </w:trPr>
+        <w:tc>
+          <w:tcPr>
+            <w:tcW w:type="dxa" w:w="2608"/>
+            <w:shd w:val="clear" w:color="auto" w:fill="1F4E79"/>
+          </w:tcPr>
+          <w:p>
+            <w:r/>
+            <w:r>
+              <w:rPr>
+                <w:b/>
+                <w:color w:val="FFFFFF"/>
+                <w:sz w:val="18"/>
+              </w:rPr>
+              <w:t>Option</w:t>
+            </w:r>
+          </w:p>
+        </w:tc>
+        <w:tc>
+          <w:tcPr>
+            <w:tcW w:type="dxa" w:w="3402"/>
+            <w:shd w:val="clear" w:color="auto" w:fill="1F4E79"/>
+          </w:tcPr>
+          <w:p>
+            <w:r/>
+            <w:r>
+              <w:rPr>
+                <w:b/>
+                <w:color w:val="FFFFFF"/>
+                <w:sz w:val="18"/>
+              </w:rPr>
+              <w:t>Normal extremes (e.g. 10 → 15 mm)</w:t>
+            </w:r>
+          </w:p>
+        </w:tc>
+        <w:tc>
+          <w:tcPr>
+            <w:tcW w:type="dxa" w:w="3402"/>
+            <w:shd w:val="clear" w:color="auto" w:fill="1F4E79"/>
+          </w:tcPr>
+          <w:p>
+            <w:r/>
+            <w:r>
+              <w:rPr>
+                <w:b/>
+                <w:color w:val="FFFFFF"/>
+                <w:sz w:val="18"/>
+              </w:rPr>
+              <w:t>Pathological cases (drizzle top)</w:t>
+            </w:r>
+          </w:p>
+        </w:tc>
+      </w:tr>
+      <w:tr>
+        <w:trPr>
+          <w:cantSplit/>
+        </w:trPr>
+        <w:tc>
+          <w:tcPr>
+            <w:tcW w:type="dxa" w:w="2608"/>
+          </w:tcPr>
+          <w:p>
+            <w:r/>
+            <w:r>
+              <w:rPr>
+                <w:b/>
+                <w:sz w:val="18"/>
+              </w:rPr>
+              <w:t>Plain QDM</w:t>
+            </w:r>
+            <w:r>
+              <w:rPr>
+                <w:sz w:val="18"/>
+              </w:rPr>
+            </w:r>
+          </w:p>
+        </w:tc>
+        <w:tc>
+          <w:tcPr>
+            <w:tcW w:type="dxa" w:w="3402"/>
+          </w:tcPr>
+          <w:p>
+            <w:r/>
+            <w:r>
+              <w:rPr>
+                <w:sz w:val="18"/>
+              </w:rPr>
+              <w:t>Change preserved exactly.</w:t>
+            </w:r>
+          </w:p>
+        </w:tc>
+        <w:tc>
+          <w:tcPr>
+            <w:tcW w:type="dxa" w:w="3402"/>
+          </w:tcPr>
+          <w:p>
+            <w:r/>
+            <w:r>
+              <w:rPr>
+                <w:sz w:val="18"/>
+              </w:rPr>
+              <w:t>Up to 800–1300 mm/day.</w:t>
+            </w:r>
+          </w:p>
+        </w:tc>
+      </w:tr>
+      <w:tr>
+        <w:trPr>
+          <w:cantSplit/>
+        </w:trPr>
+        <w:tc>
+          <w:tcPr>
+            <w:tcW w:type="dxa" w:w="2608"/>
+            <w:shd w:val="clear" w:color="auto" w:fill="EAF1F8"/>
+          </w:tcPr>
+          <w:p>
+            <w:r/>
+            <w:r>
+              <w:rPr>
+                <w:b/>
+                <w:sz w:val="18"/>
+              </w:rPr>
+              <w:t>Additive above hq (current)</w:t>
+            </w:r>
+            <w:r>
+              <w:rPr>
+                <w:sz w:val="18"/>
+              </w:rPr>
+            </w:r>
+          </w:p>
+        </w:tc>
+        <w:tc>
+          <w:tcPr>
+            <w:tcW w:type="dxa" w:w="3402"/>
+            <w:shd w:val="clear" w:color="auto" w:fill="EAF1F8"/>
+          </w:tcPr>
+          <w:p>
+            <w:r/>
+            <w:r>
+              <w:rPr>
+                <w:sz w:val="18"/>
+              </w:rPr>
+              <w:t>Slightly dampened.</w:t>
+            </w:r>
+          </w:p>
+        </w:tc>
+        <w:tc>
+          <w:tcPr>
+            <w:tcW w:type="dxa" w:w="3402"/>
+            <w:shd w:val="clear" w:color="auto" w:fill="EAF1F8"/>
+          </w:tcPr>
+          <w:p>
+            <w:r/>
+            <w:r>
+              <w:rPr>
+                <w:sz w:val="18"/>
+              </w:rPr>
+              <w:t>Under control (~100–400 mm/day).</w:t>
+            </w:r>
+          </w:p>
+        </w:tc>
+      </w:tr>
+      <w:tr>
+        <w:trPr>
+          <w:cantSplit/>
+        </w:trPr>
+        <w:tc>
+          <w:tcPr>
+            <w:tcW w:type="dxa" w:w="2608"/>
+          </w:tcPr>
+          <w:p>
+            <w:r/>
+            <w:r>
+              <w:rPr>
+                <w:b/>
+                <w:sz w:val="18"/>
+              </w:rPr>
+              <w:t>Targeted cap on Δ (MBC style)</w:t>
+            </w:r>
+            <w:r>
+              <w:rPr>
+                <w:sz w:val="18"/>
+              </w:rPr>
+            </w:r>
+          </w:p>
+        </w:tc>
+        <w:tc>
+          <w:tcPr>
+            <w:tcW w:type="dxa" w:w="3402"/>
+          </w:tcPr>
+          <w:p>
+            <w:r/>
+            <w:r>
+              <w:rPr>
+                <w:sz w:val="18"/>
+              </w:rPr>
+              <w:t>Preserved.</w:t>
+            </w:r>
+          </w:p>
+        </w:tc>
+        <w:tc>
+          <w:tcPr>
+            <w:tcW w:type="dxa" w:w="3402"/>
+          </w:tcPr>
+          <w:p>
+            <w:r/>
+            <w:r>
+              <w:rPr>
+                <w:sz w:val="18"/>
+              </w:rPr>
+              <w:t>Under control if the threshold is adapted; the threshold is a choice.</w:t>
+            </w:r>
+          </w:p>
+        </w:tc>
+      </w:tr>
+    </w:tbl>
+    <w:p>
+      <w:pPr>
+        <w:spacing w:after="40"/>
+      </w:pPr>
+    </w:p>
+    <w:p>
+      <w:r>
+        <w:rPr>
+          <w:b/>
+        </w:rPr>
+        <w:t xml:space="preserve">Decision: </w:t>
+      </w:r>
+      <w:r>
+        <w:rPr>
+          <w:i w:val="0"/>
+        </w:rPr>
+        <w:t>keep the current rule for now and judge on the real data — share of wet days above hq (section 4b) and preservation of Rx1day per zone and over Europe (section 3.2b). If the dampening of the extremes over Europe is not negligible, move to a targeted cap.</w:t>
+      </w:r>
+    </w:p>
+    <w:p>
+      <w:pPr>
+        <w:pStyle w:val="Heading2"/>
+      </w:pPr>
+      <w:r>
         <w:t>Checks of the new version (notebook 4)</w:t>
       </w:r>
     </w:p>
@@ -2113,6 +2442,18 @@
           <w:i w:val="0"/>
         </w:rPr>
         <w:t>Crop suitability with the delta method on the BIO variables rather than with the bias-adjusted GCM.</w:t>
+      </w:r>
+    </w:p>
+    <w:p>
+      <w:pPr>
+        <w:pStyle w:val="ListBullet"/>
+        <w:spacing w:after="40"/>
+      </w:pPr>
+      <w:r>
+        <w:rPr>
+          <w:i w:val="0"/>
+        </w:rPr>
+        <w:t>pr extremes: additive rule above hq (safe, slightly dampens the change of normal extremes) or a targeted cap on the relative change (Section 5.1); how sensitive is LISFLOOD (floods) to the extremes?</w:t>
       </w:r>
     </w:p>
     <w:p>

</xml_diff>

<commit_message>
Method note: section 5.2, real-data test over Europe (precip_regimes): plain QDM retained for pr extremes
Co-Authored-By: Claude Opus 5.5 <noreply@anthropic.com>
</commit_message>
<xml_diff>
--- a/GCM_BA/GCM_BA_F1_method_notes.docx
+++ b/GCM_BA/GCM_BA_F1_method_notes.docx
@@ -16,7 +16,7 @@
           <w:i/>
           <w:sz w:val="20"/>
         </w:rPr>
-        <w:t>Elisa Michiels — PhD, Politecnico di Milano / JRC — 26 October 2026</w:t>
+        <w:t>Elisa Michiels — PhD, Politecnico di Milano / JRC — 27 October 2026</w:t>
       </w:r>
     </w:p>
     <w:p>
@@ -378,7 +378,7 @@
               <w:rPr>
                 <w:sz w:val="18"/>
               </w:rPr>
-              <w:t>Solved: 50 quantiles for pr and constant (additive) correction above the model's last quantile. Maxima now 296–412 mm/day, close to the raw maxima.</w:t>
+              <w:t>Over Europe, plain QDM of the final version has no outliers (max 194–295 mm/day; Section 5.2). The extreme cases are outside Europe, where the F1 outputs are not used.</w:t>
             </w:r>
           </w:p>
         </w:tc>
@@ -1849,7 +1849,7 @@
               <w:rPr>
                 <w:sz w:val="18"/>
               </w:rPr>
-              <w:t>Above the model's last historical quantile hq: QDM(hq) + (x − hq), the value QDM gives to hq in that run plus the excess unchanged (in the historical run QDM(hq) = ERA5's last quantile).</w:t>
+              <w:t>Plain QDM: no rule above the model's last historical quantile hq (xsdba, constant extrapolation of the last factor).</w:t>
             </w:r>
           </w:p>
         </w:tc>
@@ -1863,7 +1863,7 @@
               <w:rPr>
                 <w:sz w:val="18"/>
               </w:rPr>
-              <w:t>Constant correction of Boé et al. (2007), as cited by Cannon et al. (2015). Continuous at hq and strictly increasing above it: local test with a wetter future, 65 inversions across hq and none above, against 22 180 across hq with x − hq + ref.</w:t>
+              <w:t>Tested over Europe against an additive rule and a targeted cap (Sections 5.1–5.2): no outliers, best Rx1day calibration, change of Rx1day preserved (slope 0.95–1.00 vs 0.84–0.93 with the additive rule).</w:t>
             </w:r>
           </w:p>
         </w:tc>
@@ -2199,7 +2199,7 @@
                 <w:b/>
                 <w:sz w:val="18"/>
               </w:rPr>
-              <w:t>Additive above hq (current)</w:t>
+              <w:t>Additive above hq</w:t>
             </w:r>
             <w:r>
               <w:rPr>
@@ -2303,13 +2303,1884 @@
         <w:rPr>
           <w:b/>
         </w:rPr>
+        <w:t xml:space="preserve">Status: </w:t>
+      </w:r>
+      <w:r>
+        <w:rPr>
+          <w:i w:val="0"/>
+        </w:rPr>
+        <w:t>these three options were then compared on the real data over Europe (Section 5.2).</w:t>
+      </w:r>
+    </w:p>
+    <w:p>
+      <w:pPr>
+        <w:pStyle w:val="Heading2"/>
+      </w:pPr>
+      <w:r>
+        <w:t>5.2 Test on the real data over Europe (notebook precip_regimes)</w:t>
+      </w:r>
+    </w:p>
+    <w:p>
+      <w:r>
+        <w:rPr>
+          <w:i w:val="0"/>
+        </w:rPr>
+        <w:t>Notebook GCM_BA/0_precip_regimes, run on BDAP on 27 October 2026, region 35–72 N, 25 W–45 E, land pixels of the LISFLOOD domain, raw data 1981–2014 (ERA5, EC-Earth3 historical) and the four 50-year runs. Sections 1–3 look at the raw data only; section 4 trains the new F1 for pr on the region (3-month windows, jitter, 100 quantiles) and compares the three treatments of the days above hq, with the same jitter so that they differ only above hq.</w:t>
+      </w:r>
+    </w:p>
+    <w:p>
+      <w:r>
+        <w:rPr>
+          <w:b/>
+        </w:rPr>
+        <w:t xml:space="preserve">Dry days (section 1). </w:t>
+      </w:r>
+      <w:r>
+        <w:rPr>
+          <w:i w:val="0"/>
+        </w:rPr>
+        <w:t>EC-Earth3 has too many dry days in summer: fraction of days &lt; 0.1 mm/day 0.53 vs 0.41 in ERA5 in August (&lt; 1 mm/day: 0.72 vs 0.66), close to ERA5 in winter. QDM with jitter therefore turns about 12 % of the summer dry days into wet days, about half of them drizzle (&lt; 1 mm/day), as in ERA5; they are picked at random among the dry days (as with the WDF) but add only about 1 mm per month in August. The runs change the dry-day fraction only slightly (+0.01 to +0.04 in summer), a change carried by QDM through the ranks. The bias varies strongly through the year (about 0 in January, +12 points in August): a correction per month is needed.</w:t>
+      </w:r>
+    </w:p>
+    <w:p>
+      <w:r>
+        <w:rPr>
+          <w:b/>
+        </w:rPr>
+        <w:t xml:space="preserve">Jumps between months (section 2). </w:t>
+      </w:r>
+      <w:r>
+        <w:rPr>
+          <w:i w:val="0"/>
+        </w:rPr>
+        <w:t>Change of the ERA5 − EC-Earth3 historical bias from one month to the next (roughly the jump of a monthly correction), land mean / 95th percentile over the pixels:</w:t>
+      </w:r>
+    </w:p>
+    <w:tbl>
+      <w:tblPr>
+        <w:tblStyle w:val="TableGrid"/>
+        <w:tblW w:type="auto" w:w="0"/>
+        <w:jc w:val="center"/>
+        <w:tblLayout w:type="fixed"/>
+        <w:tblLook w:firstColumn="1" w:firstRow="1" w:lastColumn="0" w:lastRow="0" w:noHBand="0" w:noVBand="1" w:val="04A0"/>
+      </w:tblPr>
+      <w:tblGrid>
+        <w:gridCol w:w="3137"/>
+        <w:gridCol w:w="3137"/>
+        <w:gridCol w:w="3137"/>
+      </w:tblGrid>
+      <w:tr>
+        <w:trPr>
+          <w:cantSplit/>
+        </w:trPr>
+        <w:tc>
+          <w:tcPr>
+            <w:tcW w:type="dxa" w:w="2268"/>
+            <w:shd w:val="clear" w:color="auto" w:fill="1F4E79"/>
+          </w:tcPr>
+          <w:p>
+            <w:r/>
+            <w:r>
+              <w:rPr>
+                <w:b/>
+                <w:color w:val="FFFFFF"/>
+                <w:sz w:val="18"/>
+              </w:rPr>
+              <w:t>Variable</w:t>
+            </w:r>
+          </w:p>
+        </w:tc>
+        <w:tc>
+          <w:tcPr>
+            <w:tcW w:type="dxa" w:w="2835"/>
+            <w:shd w:val="clear" w:color="auto" w:fill="1F4E79"/>
+          </w:tcPr>
+          <w:p>
+            <w:r/>
+            <w:r>
+              <w:rPr>
+                <w:b/>
+                <w:color w:val="FFFFFF"/>
+                <w:sz w:val="18"/>
+              </w:rPr>
+              <w:t>Calendar months</w:t>
+            </w:r>
+          </w:p>
+        </w:tc>
+        <w:tc>
+          <w:tcPr>
+            <w:tcW w:type="dxa" w:w="2835"/>
+            <w:shd w:val="clear" w:color="auto" w:fill="1F4E79"/>
+          </w:tcPr>
+          <w:p>
+            <w:r/>
+            <w:r>
+              <w:rPr>
+                <w:b/>
+                <w:color w:val="FFFFFF"/>
+                <w:sz w:val="18"/>
+              </w:rPr>
+              <w:t>3-month windows</w:t>
+            </w:r>
+          </w:p>
+        </w:tc>
+      </w:tr>
+      <w:tr>
+        <w:trPr>
+          <w:cantSplit/>
+        </w:trPr>
+        <w:tc>
+          <w:tcPr>
+            <w:tcW w:type="dxa" w:w="2268"/>
+          </w:tcPr>
+          <w:p>
+            <w:r/>
+            <w:r>
+              <w:rPr>
+                <w:sz w:val="18"/>
+              </w:rPr>
+              <w:t>tasmax (°C)</w:t>
+            </w:r>
+          </w:p>
+        </w:tc>
+        <w:tc>
+          <w:tcPr>
+            <w:tcW w:type="dxa" w:w="2835"/>
+          </w:tcPr>
+          <w:p>
+            <w:r/>
+            <w:r>
+              <w:rPr>
+                <w:sz w:val="18"/>
+              </w:rPr>
+              <w:t>0.84 / 2.30</w:t>
+            </w:r>
+          </w:p>
+        </w:tc>
+        <w:tc>
+          <w:tcPr>
+            <w:tcW w:type="dxa" w:w="2835"/>
+          </w:tcPr>
+          <w:p>
+            <w:r/>
+            <w:r>
+              <w:rPr>
+                <w:sz w:val="18"/>
+              </w:rPr>
+              <w:t>0.49 / 1.29</w:t>
+            </w:r>
+          </w:p>
+        </w:tc>
+      </w:tr>
+      <w:tr>
+        <w:trPr>
+          <w:cantSplit/>
+        </w:trPr>
+        <w:tc>
+          <w:tcPr>
+            <w:tcW w:type="dxa" w:w="2268"/>
+            <w:shd w:val="clear" w:color="auto" w:fill="EAF1F8"/>
+          </w:tcPr>
+          <w:p>
+            <w:r/>
+            <w:r>
+              <w:rPr>
+                <w:sz w:val="18"/>
+              </w:rPr>
+              <w:t>pr (%)</w:t>
+            </w:r>
+          </w:p>
+        </w:tc>
+        <w:tc>
+          <w:tcPr>
+            <w:tcW w:type="dxa" w:w="2835"/>
+            <w:shd w:val="clear" w:color="auto" w:fill="EAF1F8"/>
+          </w:tcPr>
+          <w:p>
+            <w:r/>
+            <w:r>
+              <w:rPr>
+                <w:sz w:val="18"/>
+              </w:rPr>
+              <w:t>25 / 72</w:t>
+            </w:r>
+          </w:p>
+        </w:tc>
+        <w:tc>
+          <w:tcPr>
+            <w:tcW w:type="dxa" w:w="2835"/>
+            <w:shd w:val="clear" w:color="auto" w:fill="EAF1F8"/>
+          </w:tcPr>
+          <w:p>
+            <w:r/>
+            <w:r>
+              <w:rPr>
+                <w:sz w:val="18"/>
+              </w:rPr>
+              <w:t>13 / 38</w:t>
+            </w:r>
+          </w:p>
+        </w:tc>
+      </w:tr>
+    </w:tbl>
+    <w:p>
+      <w:pPr>
+        <w:spacing w:after="40"/>
+      </w:pPr>
+    </w:p>
+    <w:p>
+      <w:r>
+        <w:rPr>
+          <w:i w:val="0"/>
+        </w:rPr>
+        <w:t>The 3-month windows halve the jumps. The remaining step (0.5 °C) is well below the day-to-day variation of tasmax (2–3 °C). Cost: where the bias peaks (August pr: +75 % per calendar month, +52 % on the 3-month window), the windows leave a small bias in that month (to be measured by section 2.4 of notebook 4).</w:t>
+      </w:r>
+    </w:p>
+    <w:p>
+      <w:r>
+        <w:rPr>
+          <w:b/>
+        </w:rPr>
+        <w:t xml:space="preserve">Days above hq (section 3). </w:t>
+      </w:r>
+      <w:r>
+        <w:rPr>
+          <w:i w:val="0"/>
+        </w:rPr>
+        <w:t>hq = 99.5th percentile of EC-Earth3 historical (all days, 3-month window). In the historical run about 0.8 % of the wet days are above hq (0.5 % of all days); in the runs 1.0–1.6 %, mostly just above it (x / hq: median 1.18, 99th percentile 2.4; x / hq &gt; 5 for 0.01–0.04 % of these days; hq &lt; 1 mm/day in only 0.09 % of the pixel-months). The annual maximum is about 0.45 % of the wet days, so nearly every Rx1day is above hq: the treatment above hq decides Rx1day, the quantity that matters for floods. The choice therefore had to be tested, not skipped.</w:t>
+      </w:r>
+    </w:p>
+    <w:p>
+      <w:r>
+        <w:rPr>
+          <w:b/>
+        </w:rPr>
+        <w:t xml:space="preserve">Outliers (section 4). </w:t>
+      </w:r>
+      <w:r>
+        <w:rPr>
+          <w:i w:val="0"/>
+        </w:rPr>
+        <w:t>Largest value over the land pixels (mm/day):</w:t>
+      </w:r>
+    </w:p>
+    <w:tbl>
+      <w:tblPr>
+        <w:tblStyle w:val="TableGrid"/>
+        <w:tblW w:type="auto" w:w="0"/>
+        <w:jc w:val="center"/>
+        <w:tblLayout w:type="fixed"/>
+        <w:tblLook w:firstColumn="1" w:firstRow="1" w:lastColumn="0" w:lastRow="0" w:noHBand="0" w:noVBand="1" w:val="04A0"/>
+      </w:tblPr>
+      <w:tblGrid>
+        <w:gridCol w:w="1882"/>
+        <w:gridCol w:w="1882"/>
+        <w:gridCol w:w="1882"/>
+        <w:gridCol w:w="1882"/>
+        <w:gridCol w:w="1882"/>
+      </w:tblGrid>
+      <w:tr>
+        <w:trPr>
+          <w:cantSplit/>
+        </w:trPr>
+        <w:tc>
+          <w:tcPr>
+            <w:tcW w:type="dxa" w:w="2494"/>
+            <w:shd w:val="clear" w:color="auto" w:fill="1F4E79"/>
+          </w:tcPr>
+          <w:p>
+            <w:r/>
+            <w:r>
+              <w:rPr>
+                <w:b/>
+                <w:color w:val="FFFFFF"/>
+                <w:sz w:val="18"/>
+              </w:rPr>
+              <w:t>Run</w:t>
+            </w:r>
+          </w:p>
+        </w:tc>
+        <w:tc>
+          <w:tcPr>
+            <w:tcW w:type="dxa" w:w="1247"/>
+            <w:shd w:val="clear" w:color="auto" w:fill="1F4E79"/>
+          </w:tcPr>
+          <w:p>
+            <w:r/>
+            <w:r>
+              <w:rPr>
+                <w:b/>
+                <w:color w:val="FFFFFF"/>
+                <w:sz w:val="18"/>
+              </w:rPr>
+              <w:t>Raw</w:t>
+            </w:r>
+          </w:p>
+        </w:tc>
+        <w:tc>
+          <w:tcPr>
+            <w:tcW w:type="dxa" w:w="1474"/>
+            <w:shd w:val="clear" w:color="auto" w:fill="1F4E79"/>
+          </w:tcPr>
+          <w:p>
+            <w:r/>
+            <w:r>
+              <w:rPr>
+                <w:b/>
+                <w:color w:val="FFFFFF"/>
+                <w:sz w:val="18"/>
+              </w:rPr>
+              <w:t>Plain QDM</w:t>
+            </w:r>
+          </w:p>
+        </w:tc>
+        <w:tc>
+          <w:tcPr>
+            <w:tcW w:type="dxa" w:w="1928"/>
+            <w:shd w:val="clear" w:color="auto" w:fill="1F4E79"/>
+          </w:tcPr>
+          <w:p>
+            <w:r/>
+            <w:r>
+              <w:rPr>
+                <w:b/>
+                <w:color w:val="FFFFFF"/>
+                <w:sz w:val="18"/>
+              </w:rPr>
+              <w:t>Additive above hq</w:t>
+            </w:r>
+          </w:p>
+        </w:tc>
+        <w:tc>
+          <w:tcPr>
+            <w:tcW w:type="dxa" w:w="1701"/>
+            <w:shd w:val="clear" w:color="auto" w:fill="1F4E79"/>
+          </w:tcPr>
+          <w:p>
+            <w:r/>
+            <w:r>
+              <w:rPr>
+                <w:b/>
+                <w:color w:val="FFFFFF"/>
+                <w:sz w:val="18"/>
+              </w:rPr>
+              <w:t>Targeted cap</w:t>
+            </w:r>
+          </w:p>
+        </w:tc>
+      </w:tr>
+      <w:tr>
+        <w:trPr>
+          <w:cantSplit/>
+        </w:trPr>
+        <w:tc>
+          <w:tcPr>
+            <w:tcW w:type="dxa" w:w="2494"/>
+          </w:tcPr>
+          <w:p>
+            <w:r/>
+            <w:r>
+              <w:rPr>
+                <w:sz w:val="18"/>
+              </w:rPr>
+              <w:t>EC-Earth3 historical</w:t>
+            </w:r>
+          </w:p>
+        </w:tc>
+        <w:tc>
+          <w:tcPr>
+            <w:tcW w:type="dxa" w:w="1247"/>
+          </w:tcPr>
+          <w:p>
+            <w:r/>
+            <w:r>
+              <w:rPr>
+                <w:sz w:val="18"/>
+              </w:rPr>
+              <w:t>164</w:t>
+            </w:r>
+          </w:p>
+        </w:tc>
+        <w:tc>
+          <w:tcPr>
+            <w:tcW w:type="dxa" w:w="1474"/>
+          </w:tcPr>
+          <w:p>
+            <w:r/>
+            <w:r>
+              <w:rPr>
+                <w:sz w:val="18"/>
+              </w:rPr>
+              <w:t>195</w:t>
+            </w:r>
+          </w:p>
+        </w:tc>
+        <w:tc>
+          <w:tcPr>
+            <w:tcW w:type="dxa" w:w="1928"/>
+          </w:tcPr>
+          <w:p>
+            <w:r/>
+            <w:r>
+              <w:rPr>
+                <w:sz w:val="18"/>
+              </w:rPr>
+              <w:t>174</w:t>
+            </w:r>
+          </w:p>
+        </w:tc>
+        <w:tc>
+          <w:tcPr>
+            <w:tcW w:type="dxa" w:w="1701"/>
+          </w:tcPr>
+          <w:p>
+            <w:r/>
+            <w:r>
+              <w:rPr>
+                <w:sz w:val="18"/>
+              </w:rPr>
+              <w:t>195</w:t>
+            </w:r>
+          </w:p>
+        </w:tc>
+      </w:tr>
+      <w:tr>
+        <w:trPr>
+          <w:cantSplit/>
+        </w:trPr>
+        <w:tc>
+          <w:tcPr>
+            <w:tcW w:type="dxa" w:w="2494"/>
+            <w:shd w:val="clear" w:color="auto" w:fill="EAF1F8"/>
+          </w:tcPr>
+          <w:p>
+            <w:r/>
+            <w:r>
+              <w:rPr>
+                <w:sz w:val="18"/>
+              </w:rPr>
+              <w:t>2025 original</w:t>
+            </w:r>
+          </w:p>
+        </w:tc>
+        <w:tc>
+          <w:tcPr>
+            <w:tcW w:type="dxa" w:w="1247"/>
+            <w:shd w:val="clear" w:color="auto" w:fill="EAF1F8"/>
+          </w:tcPr>
+          <w:p>
+            <w:r/>
+            <w:r>
+              <w:rPr>
+                <w:sz w:val="18"/>
+              </w:rPr>
+              <w:t>174</w:t>
+            </w:r>
+          </w:p>
+        </w:tc>
+        <w:tc>
+          <w:tcPr>
+            <w:tcW w:type="dxa" w:w="1474"/>
+            <w:shd w:val="clear" w:color="auto" w:fill="EAF1F8"/>
+          </w:tcPr>
+          <w:p>
+            <w:r/>
+            <w:r>
+              <w:rPr>
+                <w:sz w:val="18"/>
+              </w:rPr>
+              <w:t>242</w:t>
+            </w:r>
+          </w:p>
+        </w:tc>
+        <w:tc>
+          <w:tcPr>
+            <w:tcW w:type="dxa" w:w="1928"/>
+            <w:shd w:val="clear" w:color="auto" w:fill="EAF1F8"/>
+          </w:tcPr>
+          <w:p>
+            <w:r/>
+            <w:r>
+              <w:rPr>
+                <w:sz w:val="18"/>
+              </w:rPr>
+              <w:t>184</w:t>
+            </w:r>
+          </w:p>
+        </w:tc>
+        <w:tc>
+          <w:tcPr>
+            <w:tcW w:type="dxa" w:w="1701"/>
+            <w:shd w:val="clear" w:color="auto" w:fill="EAF1F8"/>
+          </w:tcPr>
+          <w:p>
+            <w:r/>
+            <w:r>
+              <w:rPr>
+                <w:sz w:val="18"/>
+              </w:rPr>
+              <w:t>242</w:t>
+            </w:r>
+          </w:p>
+        </w:tc>
+      </w:tr>
+      <w:tr>
+        <w:trPr>
+          <w:cantSplit/>
+        </w:trPr>
+        <w:tc>
+          <w:tcPr>
+            <w:tcW w:type="dxa" w:w="2494"/>
+          </w:tcPr>
+          <w:p>
+            <w:r/>
+            <w:r>
+              <w:rPr>
+                <w:sz w:val="18"/>
+              </w:rPr>
+              <w:t>2025 hosing</w:t>
+            </w:r>
+          </w:p>
+        </w:tc>
+        <w:tc>
+          <w:tcPr>
+            <w:tcW w:type="dxa" w:w="1247"/>
+          </w:tcPr>
+          <w:p>
+            <w:r/>
+            <w:r>
+              <w:rPr>
+                <w:sz w:val="18"/>
+              </w:rPr>
+              <w:t>160</w:t>
+            </w:r>
+          </w:p>
+        </w:tc>
+        <w:tc>
+          <w:tcPr>
+            <w:tcW w:type="dxa" w:w="1474"/>
+          </w:tcPr>
+          <w:p>
+            <w:r/>
+            <w:r>
+              <w:rPr>
+                <w:sz w:val="18"/>
+              </w:rPr>
+              <w:t>218</w:t>
+            </w:r>
+          </w:p>
+        </w:tc>
+        <w:tc>
+          <w:tcPr>
+            <w:tcW w:type="dxa" w:w="1928"/>
+          </w:tcPr>
+          <w:p>
+            <w:r/>
+            <w:r>
+              <w:rPr>
+                <w:sz w:val="18"/>
+              </w:rPr>
+              <w:t>157</w:t>
+            </w:r>
+          </w:p>
+        </w:tc>
+        <w:tc>
+          <w:tcPr>
+            <w:tcW w:type="dxa" w:w="1701"/>
+          </w:tcPr>
+          <w:p>
+            <w:r/>
+            <w:r>
+              <w:rPr>
+                <w:sz w:val="18"/>
+              </w:rPr>
+              <w:t>218</w:t>
+            </w:r>
+          </w:p>
+        </w:tc>
+      </w:tr>
+      <w:tr>
+        <w:trPr>
+          <w:cantSplit/>
+        </w:trPr>
+        <w:tc>
+          <w:tcPr>
+            <w:tcW w:type="dxa" w:w="2494"/>
+            <w:shd w:val="clear" w:color="auto" w:fill="EAF1F8"/>
+          </w:tcPr>
+          <w:p>
+            <w:r/>
+            <w:r>
+              <w:rPr>
+                <w:sz w:val="18"/>
+              </w:rPr>
+              <w:t>2050 original</w:t>
+            </w:r>
+          </w:p>
+        </w:tc>
+        <w:tc>
+          <w:tcPr>
+            <w:tcW w:type="dxa" w:w="1247"/>
+            <w:shd w:val="clear" w:color="auto" w:fill="EAF1F8"/>
+          </w:tcPr>
+          <w:p>
+            <w:r/>
+            <w:r>
+              <w:rPr>
+                <w:sz w:val="18"/>
+              </w:rPr>
+              <w:t>169</w:t>
+            </w:r>
+          </w:p>
+        </w:tc>
+        <w:tc>
+          <w:tcPr>
+            <w:tcW w:type="dxa" w:w="1474"/>
+            <w:shd w:val="clear" w:color="auto" w:fill="EAF1F8"/>
+          </w:tcPr>
+          <w:p>
+            <w:r/>
+            <w:r>
+              <w:rPr>
+                <w:sz w:val="18"/>
+              </w:rPr>
+              <w:t>295</w:t>
+            </w:r>
+          </w:p>
+        </w:tc>
+        <w:tc>
+          <w:tcPr>
+            <w:tcW w:type="dxa" w:w="1928"/>
+            <w:shd w:val="clear" w:color="auto" w:fill="EAF1F8"/>
+          </w:tcPr>
+          <w:p>
+            <w:r/>
+            <w:r>
+              <w:rPr>
+                <w:sz w:val="18"/>
+              </w:rPr>
+              <w:t>184</w:t>
+            </w:r>
+          </w:p>
+        </w:tc>
+        <w:tc>
+          <w:tcPr>
+            <w:tcW w:type="dxa" w:w="1701"/>
+            <w:shd w:val="clear" w:color="auto" w:fill="EAF1F8"/>
+          </w:tcPr>
+          <w:p>
+            <w:r/>
+            <w:r>
+              <w:rPr>
+                <w:sz w:val="18"/>
+              </w:rPr>
+              <w:t>295</w:t>
+            </w:r>
+          </w:p>
+        </w:tc>
+      </w:tr>
+      <w:tr>
+        <w:trPr>
+          <w:cantSplit/>
+        </w:trPr>
+        <w:tc>
+          <w:tcPr>
+            <w:tcW w:type="dxa" w:w="2494"/>
+          </w:tcPr>
+          <w:p>
+            <w:r/>
+            <w:r>
+              <w:rPr>
+                <w:sz w:val="18"/>
+              </w:rPr>
+              <w:t>2050 hosing</w:t>
+            </w:r>
+          </w:p>
+        </w:tc>
+        <w:tc>
+          <w:tcPr>
+            <w:tcW w:type="dxa" w:w="1247"/>
+          </w:tcPr>
+          <w:p>
+            <w:r/>
+            <w:r>
+              <w:rPr>
+                <w:sz w:val="18"/>
+              </w:rPr>
+              <w:t>170</w:t>
+            </w:r>
+          </w:p>
+        </w:tc>
+        <w:tc>
+          <w:tcPr>
+            <w:tcW w:type="dxa" w:w="1474"/>
+          </w:tcPr>
+          <w:p>
+            <w:r/>
+            <w:r>
+              <w:rPr>
+                <w:sz w:val="18"/>
+              </w:rPr>
+              <w:t>224</w:t>
+            </w:r>
+          </w:p>
+        </w:tc>
+        <w:tc>
+          <w:tcPr>
+            <w:tcW w:type="dxa" w:w="1928"/>
+          </w:tcPr>
+          <w:p>
+            <w:r/>
+            <w:r>
+              <w:rPr>
+                <w:sz w:val="18"/>
+              </w:rPr>
+              <w:t>176</w:t>
+            </w:r>
+          </w:p>
+        </w:tc>
+        <w:tc>
+          <w:tcPr>
+            <w:tcW w:type="dxa" w:w="1701"/>
+          </w:tcPr>
+          <w:p>
+            <w:r/>
+            <w:r>
+              <w:rPr>
+                <w:sz w:val="18"/>
+              </w:rPr>
+              <w:t>224</w:t>
+            </w:r>
+          </w:p>
+        </w:tc>
+      </w:tr>
+    </w:tbl>
+    <w:p>
+      <w:pPr>
+        <w:spacing w:after="40"/>
+      </w:pPr>
+    </w:p>
+    <w:p>
+      <w:r>
+        <w:rPr>
+          <w:i w:val="0"/>
+        </w:rPr>
+        <w:t>No day above 300 mm/day with any treatment. The largest value of plain QDM (295 mm/day, Black Sea coast, 45.3 N 37.3 E, July, 2050 original) comes from a raw value of 118 mm/day multiplied by 2.5 (ERA5's last quantile 21.4 / model's last quantile 8.6): high but plausible for that region (about 300 mm in one day in the Krymsk flood of July 2012), not an artefact. The targeted cap gives exactly the values of plain QDM: it never acts on these days.</w:t>
+      </w:r>
+    </w:p>
+    <w:p>
+      <w:r>
+        <w:rPr>
+          <w:b/>
+        </w:rPr>
+        <w:t xml:space="preserve">Calibration (section 4.1). </w:t>
+      </w:r>
+      <w:r>
+        <w:rPr>
+          <w:i w:val="0"/>
+        </w:rPr>
+        <w:t>Rx1day (annual maximum, mean over 1981–2014) of the adjusted historical vs ERA5:</w:t>
+      </w:r>
+    </w:p>
+    <w:tbl>
+      <w:tblPr>
+        <w:tblStyle w:val="TableGrid"/>
+        <w:tblW w:type="auto" w:w="0"/>
+        <w:jc w:val="center"/>
+        <w:tblLayout w:type="fixed"/>
+        <w:tblLook w:firstColumn="1" w:firstRow="1" w:lastColumn="0" w:lastRow="0" w:noHBand="0" w:noVBand="1" w:val="04A0"/>
+      </w:tblPr>
+      <w:tblGrid>
+        <w:gridCol w:w="1882"/>
+        <w:gridCol w:w="1882"/>
+        <w:gridCol w:w="1882"/>
+        <w:gridCol w:w="1882"/>
+        <w:gridCol w:w="1882"/>
+      </w:tblGrid>
+      <w:tr>
+        <w:trPr>
+          <w:cantSplit/>
+        </w:trPr>
+        <w:tc>
+          <w:tcPr>
+            <w:tcW w:type="dxa" w:w="2041"/>
+            <w:shd w:val="clear" w:color="auto" w:fill="1F4E79"/>
+          </w:tcPr>
+          <w:p>
+            <w:r/>
+            <w:r>
+              <w:rPr>
+                <w:b/>
+                <w:color w:val="FFFFFF"/>
+                <w:sz w:val="18"/>
+              </w:rPr>
+              <w:t>Historical</w:t>
+            </w:r>
+          </w:p>
+        </w:tc>
+        <w:tc>
+          <w:tcPr>
+            <w:tcW w:type="dxa" w:w="2041"/>
+            <w:shd w:val="clear" w:color="auto" w:fill="1F4E79"/>
+          </w:tcPr>
+          <w:p>
+            <w:r/>
+            <w:r>
+              <w:rPr>
+                <w:b/>
+                <w:color w:val="FFFFFF"/>
+                <w:sz w:val="18"/>
+              </w:rPr>
+              <w:t>Rx1day land mean (mm/day)</w:t>
+            </w:r>
+          </w:p>
+        </w:tc>
+        <w:tc>
+          <w:tcPr>
+            <w:tcW w:type="dxa" w:w="1814"/>
+            <w:shd w:val="clear" w:color="auto" w:fill="1F4E79"/>
+          </w:tcPr>
+          <w:p>
+            <w:r/>
+            <w:r>
+              <w:rPr>
+                <w:b/>
+                <w:color w:val="FFFFFF"/>
+                <w:sz w:val="18"/>
+              </w:rPr>
+              <w:t>Mean bias over pixels</w:t>
+            </w:r>
+          </w:p>
+        </w:tc>
+        <w:tc>
+          <w:tcPr>
+            <w:tcW w:type="dxa" w:w="1587"/>
+            <w:shd w:val="clear" w:color="auto" w:fill="1F4E79"/>
+          </w:tcPr>
+          <w:p>
+            <w:r/>
+            <w:r>
+              <w:rPr>
+                <w:b/>
+                <w:color w:val="FFFFFF"/>
+                <w:sz w:val="18"/>
+              </w:rPr>
+              <w:t>Mean |error|</w:t>
+            </w:r>
+          </w:p>
+        </w:tc>
+        <w:tc>
+          <w:tcPr>
+            <w:tcW w:type="dxa" w:w="1701"/>
+            <w:shd w:val="clear" w:color="auto" w:fill="1F4E79"/>
+          </w:tcPr>
+          <w:p>
+            <w:r/>
+            <w:r>
+              <w:rPr>
+                <w:b/>
+                <w:color w:val="FFFFFF"/>
+                <w:sz w:val="18"/>
+              </w:rPr>
+              <w:t>95th pct |error|</w:t>
+            </w:r>
+          </w:p>
+        </w:tc>
+      </w:tr>
+      <w:tr>
+        <w:trPr>
+          <w:cantSplit/>
+        </w:trPr>
+        <w:tc>
+          <w:tcPr>
+            <w:tcW w:type="dxa" w:w="2041"/>
+          </w:tcPr>
+          <w:p>
+            <w:r/>
+            <w:r>
+              <w:rPr>
+                <w:sz w:val="18"/>
+              </w:rPr>
+              <w:t>ERA5</w:t>
+            </w:r>
+          </w:p>
+        </w:tc>
+        <w:tc>
+          <w:tcPr>
+            <w:tcW w:type="dxa" w:w="2041"/>
+          </w:tcPr>
+          <w:p>
+            <w:r/>
+            <w:r>
+              <w:rPr>
+                <w:sz w:val="18"/>
+              </w:rPr>
+              <w:t>31.04</w:t>
+            </w:r>
+          </w:p>
+        </w:tc>
+        <w:tc>
+          <w:tcPr>
+            <w:tcW w:type="dxa" w:w="1814"/>
+          </w:tcPr>
+          <w:p>
+            <w:r/>
+            <w:r>
+              <w:rPr>
+                <w:sz w:val="18"/>
+              </w:rPr>
+            </w:r>
+          </w:p>
+        </w:tc>
+        <w:tc>
+          <w:tcPr>
+            <w:tcW w:type="dxa" w:w="1587"/>
+          </w:tcPr>
+          <w:p>
+            <w:r/>
+            <w:r>
+              <w:rPr>
+                <w:sz w:val="18"/>
+              </w:rPr>
+            </w:r>
+          </w:p>
+        </w:tc>
+        <w:tc>
+          <w:tcPr>
+            <w:tcW w:type="dxa" w:w="1701"/>
+          </w:tcPr>
+          <w:p>
+            <w:r/>
+            <w:r>
+              <w:rPr>
+                <w:sz w:val="18"/>
+              </w:rPr>
+            </w:r>
+          </w:p>
+        </w:tc>
+      </w:tr>
+      <w:tr>
+        <w:trPr>
+          <w:cantSplit/>
+        </w:trPr>
+        <w:tc>
+          <w:tcPr>
+            <w:tcW w:type="dxa" w:w="2041"/>
+            <w:shd w:val="clear" w:color="auto" w:fill="EAF1F8"/>
+          </w:tcPr>
+          <w:p>
+            <w:r/>
+            <w:r>
+              <w:rPr>
+                <w:sz w:val="18"/>
+              </w:rPr>
+              <w:t>Raw</w:t>
+            </w:r>
+          </w:p>
+        </w:tc>
+        <w:tc>
+          <w:tcPr>
+            <w:tcW w:type="dxa" w:w="2041"/>
+            <w:shd w:val="clear" w:color="auto" w:fill="EAF1F8"/>
+          </w:tcPr>
+          <w:p>
+            <w:r/>
+            <w:r>
+              <w:rPr>
+                <w:sz w:val="18"/>
+              </w:rPr>
+              <w:t>27.60</w:t>
+            </w:r>
+          </w:p>
+        </w:tc>
+        <w:tc>
+          <w:tcPr>
+            <w:tcW w:type="dxa" w:w="1814"/>
+            <w:shd w:val="clear" w:color="auto" w:fill="EAF1F8"/>
+          </w:tcPr>
+          <w:p>
+            <w:r/>
+            <w:r>
+              <w:rPr>
+                <w:sz w:val="18"/>
+              </w:rPr>
+              <w:t>−10.0 %</w:t>
+            </w:r>
+          </w:p>
+        </w:tc>
+        <w:tc>
+          <w:tcPr>
+            <w:tcW w:type="dxa" w:w="1587"/>
+            <w:shd w:val="clear" w:color="auto" w:fill="EAF1F8"/>
+          </w:tcPr>
+          <w:p>
+            <w:r/>
+            <w:r>
+              <w:rPr>
+                <w:sz w:val="18"/>
+              </w:rPr>
+              <w:t>11.9 %</w:t>
+            </w:r>
+          </w:p>
+        </w:tc>
+        <w:tc>
+          <w:tcPr>
+            <w:tcW w:type="dxa" w:w="1701"/>
+            <w:shd w:val="clear" w:color="auto" w:fill="EAF1F8"/>
+          </w:tcPr>
+          <w:p>
+            <w:r/>
+            <w:r>
+              <w:rPr>
+                <w:sz w:val="18"/>
+              </w:rPr>
+              <w:t>27.0 %</w:t>
+            </w:r>
+          </w:p>
+        </w:tc>
+      </w:tr>
+      <w:tr>
+        <w:trPr>
+          <w:cantSplit/>
+        </w:trPr>
+        <w:tc>
+          <w:tcPr>
+            <w:tcW w:type="dxa" w:w="2041"/>
+          </w:tcPr>
+          <w:p>
+            <w:r/>
+            <w:r>
+              <w:rPr>
+                <w:sz w:val="18"/>
+              </w:rPr>
+              <w:t>Plain QDM</w:t>
+            </w:r>
+          </w:p>
+        </w:tc>
+        <w:tc>
+          <w:tcPr>
+            <w:tcW w:type="dxa" w:w="2041"/>
+          </w:tcPr>
+          <w:p>
+            <w:r/>
+            <w:r>
+              <w:rPr>
+                <w:sz w:val="18"/>
+              </w:rPr>
+              <w:t>30.70</w:t>
+            </w:r>
+          </w:p>
+        </w:tc>
+        <w:tc>
+          <w:tcPr>
+            <w:tcW w:type="dxa" w:w="1814"/>
+          </w:tcPr>
+          <w:p>
+            <w:r/>
+            <w:r>
+              <w:rPr>
+                <w:sz w:val="18"/>
+              </w:rPr>
+              <w:t>−0.9 %</w:t>
+            </w:r>
+          </w:p>
+        </w:tc>
+        <w:tc>
+          <w:tcPr>
+            <w:tcW w:type="dxa" w:w="1587"/>
+          </w:tcPr>
+          <w:p>
+            <w:r/>
+            <w:r>
+              <w:rPr>
+                <w:sz w:val="18"/>
+              </w:rPr>
+              <w:t>4.5 %</w:t>
+            </w:r>
+          </w:p>
+        </w:tc>
+        <w:tc>
+          <w:tcPr>
+            <w:tcW w:type="dxa" w:w="1701"/>
+          </w:tcPr>
+          <w:p>
+            <w:r/>
+            <w:r>
+              <w:rPr>
+                <w:sz w:val="18"/>
+              </w:rPr>
+              <w:t>11.0 %</w:t>
+            </w:r>
+          </w:p>
+        </w:tc>
+      </w:tr>
+      <w:tr>
+        <w:trPr>
+          <w:cantSplit/>
+        </w:trPr>
+        <w:tc>
+          <w:tcPr>
+            <w:tcW w:type="dxa" w:w="2041"/>
+            <w:shd w:val="clear" w:color="auto" w:fill="EAF1F8"/>
+          </w:tcPr>
+          <w:p>
+            <w:r/>
+            <w:r>
+              <w:rPr>
+                <w:sz w:val="18"/>
+              </w:rPr>
+              <w:t>Additive above hq</w:t>
+            </w:r>
+          </w:p>
+        </w:tc>
+        <w:tc>
+          <w:tcPr>
+            <w:tcW w:type="dxa" w:w="2041"/>
+            <w:shd w:val="clear" w:color="auto" w:fill="EAF1F8"/>
+          </w:tcPr>
+          <w:p>
+            <w:r/>
+            <w:r>
+              <w:rPr>
+                <w:sz w:val="18"/>
+              </w:rPr>
+              <w:t>30.02</w:t>
+            </w:r>
+          </w:p>
+        </w:tc>
+        <w:tc>
+          <w:tcPr>
+            <w:tcW w:type="dxa" w:w="1814"/>
+            <w:shd w:val="clear" w:color="auto" w:fill="EAF1F8"/>
+          </w:tcPr>
+          <w:p>
+            <w:r/>
+            <w:r>
+              <w:rPr>
+                <w:sz w:val="18"/>
+              </w:rPr>
+              <w:t>−3.0 %</w:t>
+            </w:r>
+          </w:p>
+        </w:tc>
+        <w:tc>
+          <w:tcPr>
+            <w:tcW w:type="dxa" w:w="1587"/>
+            <w:shd w:val="clear" w:color="auto" w:fill="EAF1F8"/>
+          </w:tcPr>
+          <w:p>
+            <w:r/>
+            <w:r>
+              <w:rPr>
+                <w:sz w:val="18"/>
+              </w:rPr>
+              <w:t>4.8 %</w:t>
+            </w:r>
+          </w:p>
+        </w:tc>
+        <w:tc>
+          <w:tcPr>
+            <w:tcW w:type="dxa" w:w="1701"/>
+            <w:shd w:val="clear" w:color="auto" w:fill="EAF1F8"/>
+          </w:tcPr>
+          <w:p>
+            <w:r/>
+            <w:r>
+              <w:rPr>
+                <w:sz w:val="18"/>
+              </w:rPr>
+              <w:t>11.6 %</w:t>
+            </w:r>
+          </w:p>
+        </w:tc>
+      </w:tr>
+      <w:tr>
+        <w:trPr>
+          <w:cantSplit/>
+        </w:trPr>
+        <w:tc>
+          <w:tcPr>
+            <w:tcW w:type="dxa" w:w="2041"/>
+          </w:tcPr>
+          <w:p>
+            <w:r/>
+            <w:r>
+              <w:rPr>
+                <w:sz w:val="18"/>
+              </w:rPr>
+              <w:t>Targeted cap</w:t>
+            </w:r>
+          </w:p>
+        </w:tc>
+        <w:tc>
+          <w:tcPr>
+            <w:tcW w:type="dxa" w:w="2041"/>
+          </w:tcPr>
+          <w:p>
+            <w:r/>
+            <w:r>
+              <w:rPr>
+                <w:sz w:val="18"/>
+              </w:rPr>
+              <w:t>30.70</w:t>
+            </w:r>
+          </w:p>
+        </w:tc>
+        <w:tc>
+          <w:tcPr>
+            <w:tcW w:type="dxa" w:w="1814"/>
+          </w:tcPr>
+          <w:p>
+            <w:r/>
+            <w:r>
+              <w:rPr>
+                <w:sz w:val="18"/>
+              </w:rPr>
+              <w:t>−0.9 %</w:t>
+            </w:r>
+          </w:p>
+        </w:tc>
+        <w:tc>
+          <w:tcPr>
+            <w:tcW w:type="dxa" w:w="1587"/>
+          </w:tcPr>
+          <w:p>
+            <w:r/>
+            <w:r>
+              <w:rPr>
+                <w:sz w:val="18"/>
+              </w:rPr>
+              <w:t>4.5 %</w:t>
+            </w:r>
+          </w:p>
+        </w:tc>
+        <w:tc>
+          <w:tcPr>
+            <w:tcW w:type="dxa" w:w="1701"/>
+          </w:tcPr>
+          <w:p>
+            <w:r/>
+            <w:r>
+              <w:rPr>
+                <w:sz w:val="18"/>
+              </w:rPr>
+              <w:t>11.0 %</w:t>
+            </w:r>
+          </w:p>
+        </w:tc>
+      </w:tr>
+    </w:tbl>
+    <w:p>
+      <w:pPr>
+        <w:spacing w:after="40"/>
+      </w:pPr>
+    </w:p>
+    <w:p>
+      <w:r>
+        <w:rPr>
+          <w:b/>
+        </w:rPr>
+        <w:t xml:space="preserve">Signal (section 4.2). </w:t>
+      </w:r>
+      <w:r>
+        <w:rPr>
+          <w:i w:val="0"/>
+        </w:rPr>
+        <w:t>Change of mean Rx1day per pixel, adjusted vs raw: land mean of the change and slope of the adjusted change on the raw change across pixels (1 = preserved, &lt; 1 = dampened):</w:t>
+      </w:r>
+    </w:p>
+    <w:tbl>
+      <w:tblPr>
+        <w:tblStyle w:val="TableGrid"/>
+        <w:tblW w:type="auto" w:w="0"/>
+        <w:jc w:val="center"/>
+        <w:tblLayout w:type="fixed"/>
+        <w:tblLook w:firstColumn="1" w:firstRow="1" w:lastColumn="0" w:lastRow="0" w:noHBand="0" w:noVBand="1" w:val="04A0"/>
+      </w:tblPr>
+      <w:tblGrid>
+        <w:gridCol w:w="2353"/>
+        <w:gridCol w:w="2353"/>
+        <w:gridCol w:w="2353"/>
+        <w:gridCol w:w="2353"/>
+      </w:tblGrid>
+      <w:tr>
+        <w:trPr>
+          <w:cantSplit/>
+        </w:trPr>
+        <w:tc>
+          <w:tcPr>
+            <w:tcW w:type="dxa" w:w="2835"/>
+            <w:shd w:val="clear" w:color="auto" w:fill="1F4E79"/>
+          </w:tcPr>
+          <w:p>
+            <w:r/>
+            <w:r>
+              <w:rPr>
+                <w:b/>
+                <w:color w:val="FFFFFF"/>
+                <w:sz w:val="18"/>
+              </w:rPr>
+              <w:t>Change</w:t>
+            </w:r>
+          </w:p>
+        </w:tc>
+        <w:tc>
+          <w:tcPr>
+            <w:tcW w:type="dxa" w:w="1361"/>
+            <w:shd w:val="clear" w:color="auto" w:fill="1F4E79"/>
+          </w:tcPr>
+          <w:p>
+            <w:r/>
+            <w:r>
+              <w:rPr>
+                <w:b/>
+                <w:color w:val="FFFFFF"/>
+                <w:sz w:val="18"/>
+              </w:rPr>
+              <w:t>Raw</w:t>
+            </w:r>
+          </w:p>
+        </w:tc>
+        <w:tc>
+          <w:tcPr>
+            <w:tcW w:type="dxa" w:w="2494"/>
+            <w:shd w:val="clear" w:color="auto" w:fill="1F4E79"/>
+          </w:tcPr>
+          <w:p>
+            <w:r/>
+            <w:r>
+              <w:rPr>
+                <w:b/>
+                <w:color w:val="FFFFFF"/>
+                <w:sz w:val="18"/>
+              </w:rPr>
+              <w:t>Plain QDM</w:t>
+            </w:r>
+          </w:p>
+        </w:tc>
+        <w:tc>
+          <w:tcPr>
+            <w:tcW w:type="dxa" w:w="2608"/>
+            <w:shd w:val="clear" w:color="auto" w:fill="1F4E79"/>
+          </w:tcPr>
+          <w:p>
+            <w:r/>
+            <w:r>
+              <w:rPr>
+                <w:b/>
+                <w:color w:val="FFFFFF"/>
+                <w:sz w:val="18"/>
+              </w:rPr>
+              <w:t>Additive above hq</w:t>
+            </w:r>
+          </w:p>
+        </w:tc>
+      </w:tr>
+      <w:tr>
+        <w:trPr>
+          <w:cantSplit/>
+        </w:trPr>
+        <w:tc>
+          <w:tcPr>
+            <w:tcW w:type="dxa" w:w="2835"/>
+          </w:tcPr>
+          <w:p>
+            <w:r/>
+            <w:r>
+              <w:rPr>
+                <w:sz w:val="18"/>
+              </w:rPr>
+              <w:t>2025 original vs historical</w:t>
+            </w:r>
+          </w:p>
+        </w:tc>
+        <w:tc>
+          <w:tcPr>
+            <w:tcW w:type="dxa" w:w="1361"/>
+          </w:tcPr>
+          <w:p>
+            <w:r/>
+            <w:r>
+              <w:rPr>
+                <w:sz w:val="18"/>
+              </w:rPr>
+              <w:t>+9.4 %</w:t>
+            </w:r>
+          </w:p>
+        </w:tc>
+        <w:tc>
+          <w:tcPr>
+            <w:tcW w:type="dxa" w:w="2494"/>
+          </w:tcPr>
+          <w:p>
+            <w:r/>
+            <w:r>
+              <w:rPr>
+                <w:sz w:val="18"/>
+              </w:rPr>
+              <w:t>+9.9 % (slope 0.97)</w:t>
+            </w:r>
+          </w:p>
+        </w:tc>
+        <w:tc>
+          <w:tcPr>
+            <w:tcW w:type="dxa" w:w="2608"/>
+          </w:tcPr>
+          <w:p>
+            <w:r/>
+            <w:r>
+              <w:rPr>
+                <w:sz w:val="18"/>
+              </w:rPr>
+              <w:t>+8.5 % (slope 0.86)</w:t>
+            </w:r>
+          </w:p>
+        </w:tc>
+      </w:tr>
+      <w:tr>
+        <w:trPr>
+          <w:cantSplit/>
+        </w:trPr>
+        <w:tc>
+          <w:tcPr>
+            <w:tcW w:type="dxa" w:w="2835"/>
+            <w:shd w:val="clear" w:color="auto" w:fill="EAF1F8"/>
+          </w:tcPr>
+          <w:p>
+            <w:r/>
+            <w:r>
+              <w:rPr>
+                <w:sz w:val="18"/>
+              </w:rPr>
+              <w:t>2025 hosing vs historical</w:t>
+            </w:r>
+          </w:p>
+        </w:tc>
+        <w:tc>
+          <w:tcPr>
+            <w:tcW w:type="dxa" w:w="1361"/>
+            <w:shd w:val="clear" w:color="auto" w:fill="EAF1F8"/>
+          </w:tcPr>
+          <w:p>
+            <w:r/>
+            <w:r>
+              <w:rPr>
+                <w:sz w:val="18"/>
+              </w:rPr>
+              <w:t>+5.0 %</w:t>
+            </w:r>
+          </w:p>
+        </w:tc>
+        <w:tc>
+          <w:tcPr>
+            <w:tcW w:type="dxa" w:w="2494"/>
+            <w:shd w:val="clear" w:color="auto" w:fill="EAF1F8"/>
+          </w:tcPr>
+          <w:p>
+            <w:r/>
+            <w:r>
+              <w:rPr>
+                <w:sz w:val="18"/>
+              </w:rPr>
+              <w:t>+5.4 % (0.98)</w:t>
+            </w:r>
+          </w:p>
+        </w:tc>
+        <w:tc>
+          <w:tcPr>
+            <w:tcW w:type="dxa" w:w="2608"/>
+            <w:shd w:val="clear" w:color="auto" w:fill="EAF1F8"/>
+          </w:tcPr>
+          <w:p>
+            <w:r/>
+            <w:r>
+              <w:rPr>
+                <w:sz w:val="18"/>
+              </w:rPr>
+              <w:t>+4.5 % (0.88)</w:t>
+            </w:r>
+          </w:p>
+        </w:tc>
+      </w:tr>
+      <w:tr>
+        <w:trPr>
+          <w:cantSplit/>
+        </w:trPr>
+        <w:tc>
+          <w:tcPr>
+            <w:tcW w:type="dxa" w:w="2835"/>
+          </w:tcPr>
+          <w:p>
+            <w:r/>
+            <w:r>
+              <w:rPr>
+                <w:sz w:val="18"/>
+              </w:rPr>
+              <w:t>2050 original vs historical</w:t>
+            </w:r>
+          </w:p>
+        </w:tc>
+        <w:tc>
+          <w:tcPr>
+            <w:tcW w:type="dxa" w:w="1361"/>
+          </w:tcPr>
+          <w:p>
+            <w:r/>
+            <w:r>
+              <w:rPr>
+                <w:sz w:val="18"/>
+              </w:rPr>
+              <w:t>+18.4 %</w:t>
+            </w:r>
+          </w:p>
+        </w:tc>
+        <w:tc>
+          <w:tcPr>
+            <w:tcW w:type="dxa" w:w="2494"/>
+          </w:tcPr>
+          <w:p>
+            <w:r/>
+            <w:r>
+              <w:rPr>
+                <w:sz w:val="18"/>
+              </w:rPr>
+              <w:t>+18.7 % (0.95)</w:t>
+            </w:r>
+          </w:p>
+        </w:tc>
+        <w:tc>
+          <w:tcPr>
+            <w:tcW w:type="dxa" w:w="2608"/>
+          </w:tcPr>
+          <w:p>
+            <w:r/>
+            <w:r>
+              <w:rPr>
+                <w:sz w:val="18"/>
+              </w:rPr>
+              <w:t>+16.6 % (0.84)</w:t>
+            </w:r>
+          </w:p>
+        </w:tc>
+      </w:tr>
+      <w:tr>
+        <w:trPr>
+          <w:cantSplit/>
+        </w:trPr>
+        <w:tc>
+          <w:tcPr>
+            <w:tcW w:type="dxa" w:w="2835"/>
+            <w:shd w:val="clear" w:color="auto" w:fill="EAF1F8"/>
+          </w:tcPr>
+          <w:p>
+            <w:r/>
+            <w:r>
+              <w:rPr>
+                <w:sz w:val="18"/>
+              </w:rPr>
+              <w:t>2050 hosing vs historical</w:t>
+            </w:r>
+          </w:p>
+        </w:tc>
+        <w:tc>
+          <w:tcPr>
+            <w:tcW w:type="dxa" w:w="1361"/>
+            <w:shd w:val="clear" w:color="auto" w:fill="EAF1F8"/>
+          </w:tcPr>
+          <w:p>
+            <w:r/>
+            <w:r>
+              <w:rPr>
+                <w:sz w:val="18"/>
+              </w:rPr>
+              <w:t>+13.2 %</w:t>
+            </w:r>
+          </w:p>
+        </w:tc>
+        <w:tc>
+          <w:tcPr>
+            <w:tcW w:type="dxa" w:w="2494"/>
+            <w:shd w:val="clear" w:color="auto" w:fill="EAF1F8"/>
+          </w:tcPr>
+          <w:p>
+            <w:r/>
+            <w:r>
+              <w:rPr>
+                <w:sz w:val="18"/>
+              </w:rPr>
+              <w:t>+13.6 % (0.97)</w:t>
+            </w:r>
+          </w:p>
+        </w:tc>
+        <w:tc>
+          <w:tcPr>
+            <w:tcW w:type="dxa" w:w="2608"/>
+            <w:shd w:val="clear" w:color="auto" w:fill="EAF1F8"/>
+          </w:tcPr>
+          <w:p>
+            <w:r/>
+            <w:r>
+              <w:rPr>
+                <w:sz w:val="18"/>
+              </w:rPr>
+              <w:t>+11.8 % (0.86)</w:t>
+            </w:r>
+          </w:p>
+        </w:tc>
+      </w:tr>
+      <w:tr>
+        <w:trPr>
+          <w:cantSplit/>
+        </w:trPr>
+        <w:tc>
+          <w:tcPr>
+            <w:tcW w:type="dxa" w:w="2835"/>
+          </w:tcPr>
+          <w:p>
+            <w:r/>
+            <w:r>
+              <w:rPr>
+                <w:sz w:val="18"/>
+              </w:rPr>
+              <w:t>2025 hosing vs 2025 original</w:t>
+            </w:r>
+          </w:p>
+        </w:tc>
+        <w:tc>
+          <w:tcPr>
+            <w:tcW w:type="dxa" w:w="1361"/>
+          </w:tcPr>
+          <w:p>
+            <w:r/>
+            <w:r>
+              <w:rPr>
+                <w:sz w:val="18"/>
+              </w:rPr>
+              <w:t>−3.9 %</w:t>
+            </w:r>
+          </w:p>
+        </w:tc>
+        <w:tc>
+          <w:tcPr>
+            <w:tcW w:type="dxa" w:w="2494"/>
+          </w:tcPr>
+          <w:p>
+            <w:r/>
+            <w:r>
+              <w:rPr>
+                <w:sz w:val="18"/>
+              </w:rPr>
+              <w:t>−3.9 % (0.97)</w:t>
+            </w:r>
+          </w:p>
+        </w:tc>
+        <w:tc>
+          <w:tcPr>
+            <w:tcW w:type="dxa" w:w="2608"/>
+          </w:tcPr>
+          <w:p>
+            <w:r/>
+            <w:r>
+              <w:rPr>
+                <w:sz w:val="18"/>
+              </w:rPr>
+              <w:t>−3.5 % (0.91)</w:t>
+            </w:r>
+          </w:p>
+        </w:tc>
+      </w:tr>
+      <w:tr>
+        <w:trPr>
+          <w:cantSplit/>
+        </w:trPr>
+        <w:tc>
+          <w:tcPr>
+            <w:tcW w:type="dxa" w:w="2835"/>
+            <w:shd w:val="clear" w:color="auto" w:fill="EAF1F8"/>
+          </w:tcPr>
+          <w:p>
+            <w:r/>
+            <w:r>
+              <w:rPr>
+                <w:sz w:val="18"/>
+              </w:rPr>
+              <w:t>2050 hosing vs 2050 original</w:t>
+            </w:r>
+          </w:p>
+        </w:tc>
+        <w:tc>
+          <w:tcPr>
+            <w:tcW w:type="dxa" w:w="1361"/>
+            <w:shd w:val="clear" w:color="auto" w:fill="EAF1F8"/>
+          </w:tcPr>
+          <w:p>
+            <w:r/>
+            <w:r>
+              <w:rPr>
+                <w:sz w:val="18"/>
+              </w:rPr>
+              <w:t>−4.2 %</w:t>
+            </w:r>
+          </w:p>
+        </w:tc>
+        <w:tc>
+          <w:tcPr>
+            <w:tcW w:type="dxa" w:w="2494"/>
+            <w:shd w:val="clear" w:color="auto" w:fill="EAF1F8"/>
+          </w:tcPr>
+          <w:p>
+            <w:r/>
+            <w:r>
+              <w:rPr>
+                <w:sz w:val="18"/>
+              </w:rPr>
+              <w:t>−4.1 % (1.00)</w:t>
+            </w:r>
+          </w:p>
+        </w:tc>
+        <w:tc>
+          <w:tcPr>
+            <w:tcW w:type="dxa" w:w="2608"/>
+            <w:shd w:val="clear" w:color="auto" w:fill="EAF1F8"/>
+          </w:tcPr>
+          <w:p>
+            <w:r/>
+            <w:r>
+              <w:rPr>
+                <w:sz w:val="18"/>
+              </w:rPr>
+              <w:t>−3.9 % (0.93)</w:t>
+            </w:r>
+          </w:p>
+        </w:tc>
+      </w:tr>
+    </w:tbl>
+    <w:p>
+      <w:pPr>
+        <w:spacing w:after="40"/>
+      </w:pPr>
+    </w:p>
+    <w:p>
+      <w:r>
+        <w:rPr>
+          <w:i w:val="0"/>
+        </w:rPr>
+        <w:t>The targeted cap is identical to plain QDM. The additive rule shrinks the change of the extremes by about 7–15 %, the cost anticipated in Section 5.1. It is slightly less noisy pixel by pixel for hosing vs original (mean |adjusted − raw| 1.1–1.2 vs 1.4 percentage points), but this noise averages out over a river basin, whereas the dampening is a systematic bias that does not.</w:t>
+      </w:r>
+    </w:p>
+    <w:p>
+      <w:pPr>
+        <w:pStyle w:val="Heading2"/>
+      </w:pPr>
+      <w:r>
+        <w:t>Why x / hq up to 300 did not give absurd values</w:t>
+      </w:r>
+    </w:p>
+    <w:p>
+      <w:r>
+        <w:rPr>
+          <w:i w:val="0"/>
+        </w:rPr>
+        <w:t>The ratio x / hq is not what causes an explosion. For a day above hq, plain QDM gives</w:t>
+      </w:r>
+    </w:p>
+    <w:p>
+      <w:pPr>
+        <w:jc w:val="center"/>
+      </w:pPr>
+      <w:r>
+        <w:rPr>
+          <w:i/>
+        </w:rPr>
+        <w:t>corrected value = x × (ERA5's last quantile / model's last quantile hq)</w:t>
+      </w:r>
+    </w:p>
+    <w:p>
+      <w:pPr>
+        <w:pStyle w:val="ListBullet"/>
+        <w:spacing w:after="40"/>
+      </w:pPr>
+      <w:r>
+        <w:rPr>
+          <w:i w:val="0"/>
+        </w:rPr>
+        <w:t>x / hq only says how unusual the day is for the model. QDM transfers that unusualness onto ERA5, which is what it is designed to do.</w:t>
+      </w:r>
+    </w:p>
+    <w:p>
+      <w:pPr>
+        <w:pStyle w:val="ListBullet"/>
+        <w:spacing w:after="40"/>
+      </w:pPr>
+      <w:r>
+        <w:rPr>
+          <w:i w:val="0"/>
+        </w:rPr>
+        <w:t>An explosion needs the second factor to be large: a model top that is just drizzle facing a real ERA5 storm. In north-west Australia that factor was 84 / 4.2 = ×20, hence about 1200 mm/day.</w:t>
+      </w:r>
+    </w:p>
+    <w:p>
+      <w:pPr>
+        <w:pStyle w:val="ListBullet"/>
+        <w:spacing w:after="40"/>
+      </w:pPr>
+      <w:r>
+        <w:rPr>
+          <w:i w:val="0"/>
+        </w:rPr>
+        <w:t>Over Europe, the tops of EC-Earth3 and ERA5 are of the same order: for the largest values of plain QDM the factor is between 1.1 and 2.5 (e.g. 66.7 / 56.1, 21.4 / 8.6).</w:t>
+      </w:r>
+    </w:p>
+    <w:p>
+      <w:pPr>
+        <w:pStyle w:val="ListBullet"/>
+        <w:spacing w:after="40"/>
+      </w:pPr>
+      <w:r>
+        <w:rPr>
+          <w:i w:val="0"/>
+        </w:rPr>
+        <w:t>Where x / hq reaches 300, hq is tiny, but ERA5's top there is tiny too (a dry region and month for both): the absolute value stays modest, which is why the maximum stays at 194–295 mm/day.</w:t>
+      </w:r>
+    </w:p>
+    <w:p>
+      <w:pPr>
+        <w:pStyle w:val="ListBullet"/>
+        <w:spacing w:after="40"/>
+      </w:pPr>
+      <w:r>
+        <w:rPr>
+          <w:i w:val="0"/>
+        </w:rPr>
+        <w:t>The cap, which acts only where hq &lt; 1 mm/day, never changed anything: none of the extreme days fall in those pixel-months.</w:t>
+      </w:r>
+    </w:p>
+    <w:p>
+      <w:r>
+        <w:rPr>
+          <w:b/>
+        </w:rPr>
+        <w:t xml:space="preserve">In short: </w:t>
+      </w:r>
+      <w:r>
+        <w:rPr>
+          <w:i w:val="0"/>
+        </w:rPr>
+        <w:t>section 3 showed that the stakes are real (the treatment decides Rx1day); section 4 that over Europe plain QDM has no outliers, reproduces ERA5's Rx1day best and preserves its change. The two other treatments fix a problem that does not exist over Europe, and the additive one costs about 10 % of the change of the extremes.</w:t>
+      </w:r>
+    </w:p>
+    <w:p>
+      <w:r>
+        <w:rPr>
+          <w:b/>
+        </w:rPr>
         <w:t xml:space="preserve">Decision: </w:t>
       </w:r>
       <w:r>
         <w:rPr>
           <w:i w:val="0"/>
         </w:rPr>
-        <w:t>keep the current rule for now and judge on the real data — share of wet days above hq (section 4b) and preservation of Rx1day per zone and over Europe (section 3.2b). If the dampening of the extremes over Europe is not negligible, move to a targeted cap.</w:t>
+        <w:t>plain QDM for pr (Cannon et al. 2015 as published, xsdba constant extrapolation), without rule above hq. The 800–1300 mm/day cases are outside Europe (dry regions); the bias-adjusted GCM is used only over Europe (LISFLOOD, RCM bias adjustment; crop suitability uses the delta method), so they are documented and left as they are. The RCM bias adjustment will be diagnosed with the same notebook (reference: GCM 2025 no-hosing ERA5-like; model: RCM 2025 no-hosing over their common 25 years), since its regime (finer resolution, closer calibration and application climates, different drizzle) may differ.</w:t>
       </w:r>
     </w:p>
     <w:p>
@@ -2377,7 +4248,7 @@
         <w:rPr>
           <w:i w:val="0"/>
         </w:rPr>
-        <w:t>Section 4b — order of the wet days around hq: inversions below hq (QDM itself), across hq (switch to the additive correction) and above hq.</w:t>
+        <w:t>Section 4b — order of the wet days around hq: with plain QDM, a check of QDM's own reordering of the wet days.</w:t>
       </w:r>
     </w:p>
     <w:p>
@@ -2453,7 +4324,19 @@
         <w:rPr>
           <w:i w:val="0"/>
         </w:rPr>
-        <w:t>pr extremes: additive rule above hq (safe, slightly dampens the change of normal extremes) or a targeted cap on the relative change (Section 5.1); how sensitive is LISFLOOD (floods) to the extremes?</w:t>
+        <w:t>pr extremes: plain QDM retained over Europe (Section 5.2); outliers remain possible outside Europe (dry regions), where the F1 outputs are not used.</w:t>
+      </w:r>
+    </w:p>
+    <w:p>
+      <w:pPr>
+        <w:pStyle w:val="ListBullet"/>
+        <w:spacing w:after="40"/>
+      </w:pPr>
+      <w:r>
+        <w:rPr>
+          <w:i w:val="0"/>
+        </w:rPr>
+        <w:t>RCM bias adjustment: same method family, to be confirmed with the precip_regimes notebook on the RCM pair; at which resolution (RCM grid or 0.7°) should it be done?</w:t>
       </w:r>
     </w:p>
     <w:p>

</xml_diff>